<commit_message>
docs(adr-001): reconcile to v2.4; geography-aware region-model gate (replaces legacy three-region gate)
</commit_message>
<xml_diff>
--- a/docs/adr/acrme_adr_001_region_selection.docx
+++ b/docs/adr/acrme_adr_001_region_selection.docx
@@ -49,7 +49,7 @@
         <w:t xml:space="preserve"> </w:t>
       </w:r>
       <w:r>
-        <w:t xml:space="preserve">2.3</w:t>
+        <w:t xml:space="preserve">2.4</w:t>
       </w:r>
       <w:r>
         <w:br/>
@@ -81,7 +81,7 @@
         <w:t xml:space="preserve"> </w:t>
       </w:r>
       <w:r>
-        <w:t xml:space="preserve">Accepted - supersedes ADR-001 v2.2 region-selection content</w:t>
+        <w:t xml:space="preserve">Accepted - supersedes ADR-001 v2.2 region-selection content; reconciled to Baseline v2.4</w:t>
       </w:r>
       <w:r>
         <w:br/>
@@ -97,7 +97,7 @@
         <w:t xml:space="preserve"> </w:t>
       </w:r>
       <w:r>
-        <w:t xml:space="preserve">ACRME Architecture Decision Records - aligned to Capacity &amp; Quota Management Requirements Baseline v2.3.</w:t>
+        <w:t xml:space="preserve">ACRME Architecture Decision Records - aligned to Capacity &amp; Quota Management Requirements Baseline v2.4.</w:t>
       </w:r>
     </w:p>
     <w:p>
@@ -115,7 +115,7 @@
         <w:t xml:space="preserve"> </w:t>
       </w:r>
       <w:r>
-        <w:t xml:space="preserve">An Architecture Decision Record captures a significant architectural decision, the context that forced it, the options considered, the choice made, and its consequences. This v2.3 ADR updates the accepted region-selection decision to match the consolidated requirements baseline — notably the five-geography region model with per-geography distribution models and mandatory two-region CVAL/DR co-location (PLC-010a). Evidence tags:</w:t>
+        <w:t xml:space="preserve">An Architecture Decision Record captures a significant architectural decision, the context that forced it, the options considered, the choice made, and its consequences. This ADR states the accepted region-selection decision matching the consolidated requirements baseline — notably the five-geography region model with per-geography distribution models and mandatory two-region CVAL/DR co-location (PLC-010a). Evidence tags:</w:t>
       </w:r>
       <w:r>
         <w:t xml:space="preserve"> </w:t>
@@ -164,6 +164,133 @@
       </w:r>
       <w:r>
         <w:t xml:space="preserve">.</w:t>
+      </w:r>
+    </w:p>
+    <w:p>
+      <w:pPr>
+        <w:pStyle w:val="BlockText"/>
+      </w:pPr>
+      <w:r>
+        <w:rPr>
+          <w:bCs/>
+          <w:b/>
+        </w:rPr>
+        <w:t xml:space="preserve">v2.4 reconciliation note — no region-model change.</w:t>
+      </w:r>
+      <w:r>
+        <w:t xml:space="preserve"> </w:t>
+      </w:r>
+      <w:r>
+        <w:t xml:space="preserve">Baseline v2.4 folds in the</w:t>
+      </w:r>
+      <w:r>
+        <w:t xml:space="preserve"> </w:t>
+      </w:r>
+      <w:r>
+        <w:rPr>
+          <w:iCs/>
+          <w:i/>
+        </w:rPr>
+        <w:t xml:space="preserve">reservation-model</w:t>
+      </w:r>
+      <w:r>
+        <w:t xml:space="preserve"> </w:t>
+      </w:r>
+      <w:r>
+        <w:t xml:space="preserve">gaps (seed-at-0 matrix CAP-022, per-AZ CRG structure CAP-023, reactive discovery CAP-024, Availability-Set ineligibility CAP-020/021, even zone-distribution PLC-011, naming convention OPS-006/C-12).</w:t>
+      </w:r>
+      <w:r>
+        <w:t xml:space="preserve"> </w:t>
+      </w:r>
+      <w:r>
+        <w:rPr>
+          <w:bCs/>
+          <w:b/>
+        </w:rPr>
+        <w:t xml:space="preserve">None of these change the region-selection or DR-placement decision recorded here</w:t>
+      </w:r>
+      <w:r>
+        <w:t xml:space="preserve"> </w:t>
+      </w:r>
+      <w:r>
+        <w:t xml:space="preserve">— the five-geography model, per-geography distribution models, exact-production-region-first placement,</w:t>
+      </w:r>
+      <w:r>
+        <w:t xml:space="preserve"> </w:t>
+      </w:r>
+      <w:r>
+        <w:rPr>
+          <w:rStyle w:val="VerbatimChar"/>
+        </w:rPr>
+        <w:t xml:space="preserve">CustomerSeedRecord</w:t>
+      </w:r>
+      <w:r>
+        <w:t xml:space="preserve">, two-region CVAL/DR co-location (PLC-010a) and the Middle East</w:t>
+      </w:r>
+      <w:r>
+        <w:t xml:space="preserve"> </w:t>
+      </w:r>
+      <w:r>
+        <w:rPr>
+          <w:rStyle w:val="VerbatimChar"/>
+        </w:rPr>
+        <w:t xml:space="preserve">DR_NOT_OFFERED</w:t>
+      </w:r>
+      <w:r>
+        <w:t xml:space="preserve"> </w:t>
+      </w:r>
+      <w:r>
+        <w:t xml:space="preserve">position (DEC-001) are all unchanged. The only wording update in this revision is the</w:t>
+      </w:r>
+      <w:r>
+        <w:t xml:space="preserve"> </w:t>
+      </w:r>
+      <w:r>
+        <w:rPr>
+          <w:iCs/>
+          <w:i/>
+        </w:rPr>
+        <w:t xml:space="preserve">region-model gate</w:t>
+      </w:r>
+      <w:r>
+        <w:t xml:space="preserve"> </w:t>
+      </w:r>
+      <w:r>
+        <w:t xml:space="preserve">(below), whose legacy</w:t>
+      </w:r>
+      <w:r>
+        <w:t xml:space="preserve"> </w:t>
+      </w:r>
+      <w:r>
+        <w:t xml:space="preserve">“</w:t>
+      </w:r>
+      <w:r>
+        <w:t xml:space="preserve">three-region gate</w:t>
+      </w:r>
+      <w:r>
+        <w:t xml:space="preserve">”</w:t>
+      </w:r>
+      <w:r>
+        <w:t xml:space="preserve"> </w:t>
+      </w:r>
+      <w:r>
+        <w:t xml:space="preserve">label is replaced with an explicit geography-aware statement so it can no longer be read as a universal three-distinct-regions minimum. The new per-AZ CRG structure (CAP-023) operates</w:t>
+      </w:r>
+      <w:r>
+        <w:t xml:space="preserve"> </w:t>
+      </w:r>
+      <w:r>
+        <w:rPr>
+          <w:bCs/>
+          <w:b/>
+        </w:rPr>
+        <w:t xml:space="preserve">within</w:t>
+      </w:r>
+      <w:r>
+        <w:t xml:space="preserve"> </w:t>
+      </w:r>
+      <w:r>
+        <w:t xml:space="preserve">a selected region and is specified in ADR-002/ADR-004, not here.</w:t>
       </w:r>
     </w:p>
     <w:p>
@@ -2096,19 +2223,132 @@
               <w:jc w:val="left"/>
             </w:pPr>
             <w:r>
-              <w:t xml:space="preserve">Three-region gate</w:t>
-            </w:r>
-          </w:p>
-        </w:tc>
-        <w:tc>
-          <w:tcPr/>
-          <w:p>
-            <w:pPr>
-              <w:pStyle w:val="Compact"/>
-              <w:jc w:val="left"/>
-            </w:pPr>
-            <w:r>
-              <w:t xml:space="preserve">Geography must provide Prod, CVAL, and DR separation or approved cross-geo/no-DR path.</w:t>
+              <w:t xml:space="preserve">Region-model gate (geography-aware)</w:t>
+            </w:r>
+          </w:p>
+        </w:tc>
+        <w:tc>
+          <w:tcPr/>
+          <w:p>
+            <w:pPr>
+              <w:pStyle w:val="Compact"/>
+              <w:jc w:val="left"/>
+            </w:pPr>
+            <w:r>
+              <w:t xml:space="preserve">Placement satisfies the geography’s</w:t>
+            </w:r>
+            <w:r>
+              <w:t xml:space="preserve"> </w:t>
+            </w:r>
+            <w:r>
+              <w:rPr>
+                <w:bCs/>
+                <w:b/>
+              </w:rPr>
+              <w:t xml:space="preserve">distribution model</w:t>
+            </w:r>
+            <w:r>
+              <w:t xml:space="preserve"> </w:t>
+            </w:r>
+            <w:r>
+              <w:t xml:space="preserve">(REG-001): a</w:t>
+            </w:r>
+            <w:r>
+              <w:t xml:space="preserve"> </w:t>
+            </w:r>
+            <w:r>
+              <w:rPr>
+                <w:bCs/>
+                <w:b/>
+              </w:rPr>
+              <w:t xml:space="preserve">three-region</w:t>
+            </w:r>
+            <w:r>
+              <w:t xml:space="preserve"> </w:t>
+            </w:r>
+            <w:r>
+              <w:t xml:space="preserve">geography (US) requires Prod, CVAL and DR in three distinct regions; a</w:t>
+            </w:r>
+            <w:r>
+              <w:t xml:space="preserve"> </w:t>
+            </w:r>
+            <w:r>
+              <w:rPr>
+                <w:bCs/>
+                <w:b/>
+              </w:rPr>
+              <w:t xml:space="preserve">two-region</w:t>
+            </w:r>
+            <w:r>
+              <w:t xml:space="preserve"> </w:t>
+            </w:r>
+            <w:r>
+              <w:t xml:space="preserve">geography requires Prod in one region and</w:t>
+            </w:r>
+            <w:r>
+              <w:t xml:space="preserve"> </w:t>
+            </w:r>
+            <w:r>
+              <w:rPr>
+                <w:bCs/>
+                <w:b/>
+              </w:rPr>
+              <w:t xml:space="preserve">CVAL + DR co-located</w:t>
+            </w:r>
+            <w:r>
+              <w:t xml:space="preserve"> </w:t>
+            </w:r>
+            <w:r>
+              <w:t xml:space="preserve">in the other (PLC-010a); a</w:t>
+            </w:r>
+            <w:r>
+              <w:t xml:space="preserve"> </w:t>
+            </w:r>
+            <w:r>
+              <w:rPr>
+                <w:rStyle w:val="VerbatimChar"/>
+              </w:rPr>
+              <w:t xml:space="preserve">DR_NOT_OFFERED</w:t>
+            </w:r>
+            <w:r>
+              <w:t xml:space="preserve"> </w:t>
+            </w:r>
+            <w:r>
+              <w:t xml:space="preserve">geography (Middle East, DEC-001) requires Prod + CVAL only, with no DR region. A universal</w:t>
+            </w:r>
+            <w:r>
+              <w:t xml:space="preserve"> </w:t>
+            </w:r>
+            <w:r>
+              <w:t xml:space="preserve">“</w:t>
+            </w:r>
+            <w:r>
+              <w:t xml:space="preserve">three distinct regions</w:t>
+            </w:r>
+            <w:r>
+              <w:t xml:space="preserve">”</w:t>
+            </w:r>
+            <w:r>
+              <w:t xml:space="preserve"> </w:t>
+            </w:r>
+            <w:r>
+              <w:t xml:space="preserve">minimum is</w:t>
+            </w:r>
+            <w:r>
+              <w:t xml:space="preserve"> </w:t>
+            </w:r>
+            <w:r>
+              <w:rPr>
+                <w:bCs/>
+                <w:b/>
+              </w:rPr>
+              <w:t xml:space="preserve">not</w:t>
+            </w:r>
+            <w:r>
+              <w:t xml:space="preserve"> </w:t>
+            </w:r>
+            <w:r>
+              <w:t xml:space="preserve">enforced.</w:t>
             </w:r>
           </w:p>
         </w:tc>

</xml_diff>